<commit_message>
Add export parity controls
</commit_message>
<xml_diff>
--- a/document/_extensions/longform-kit/reference.docx
+++ b/document/_extensions/longform-kit/reference.docx
@@ -929,7 +929,7 @@
     <w:pPr>
       <w:keepNext w:val="true"/>
       <w:keepLines/>
-      <w:pageBreakBefore/>
+      <w:pageBreakBefore w:val="false"/>
       <w:spacing w:before="200" w:after="0"/>
       <w:outlineLvl w:val="1"/>
     </w:pPr>
@@ -1697,6 +1697,16 @@
         <w:vAlign w:val="bottom"/>
       </w:tcPr>
     </w:tblStylePr>
+  </w:style>
+  <w:style w:type="paragraph" w:styleId="EpigraphTextFlush" w:customStyle="1">
+    <w:name w:val="Epigraph Text Flush"/>
+    <w:basedOn w:val="EpigraphText"/>
+    <w:next w:val="EpigraphSource"/>
+    <w:qFormat/>
+    <w:pPr>
+      <w:ind w:hanging="0" w:left="0"/>
+    </w:pPr>
+    <w:rPr/>
   </w:style>
 </w:styles>
 </file>

</xml_diff>